<commit_message>
Implemented Feb 2 2026 feedback
</commit_message>
<xml_diff>
--- a/docassemble/ReturnCarProperty/data/templates/fin_property_car_instructions.docx
+++ b/docassemble/ReturnCarProperty/data/templates/fin_property_car_instructions.docx
@@ -43,7 +43,7 @@
                     <pic:cNvPicPr/>
                   </pic:nvPicPr>
                   <pic:blipFill>
-                    <a:blip r:embed="rId5" cstate="print">
+                    <a:blip r:embed="rId7" cstate="print">
                       <a:extLst>
                         <a:ext uri="{28A0092B-C50C-407E-A947-70E740481C1C}">
                           <a14:useLocalDpi xmlns:a14="http://schemas.microsoft.com/office/drawing/2010/main" val="0"/>
@@ -185,7 +185,23 @@
           <w:sz w:val="24"/>
           <w:szCs w:val="24"/>
         </w:rPr>
-        <w:t xml:space="preserve"> your letter. Here’s what to do next.</w:t>
+        <w:t xml:space="preserve"> your letter</w:t>
+      </w:r>
+      <w:r>
+        <w:rPr>
+          <w:rFonts w:ascii="Muli" w:hAnsi="Muli"/>
+          <w:sz w:val="24"/>
+          <w:szCs w:val="24"/>
+        </w:rPr>
+        <w:t>s</w:t>
+      </w:r>
+      <w:r>
+        <w:rPr>
+          <w:rFonts w:ascii="Muli" w:hAnsi="Muli"/>
+          <w:sz w:val="24"/>
+          <w:szCs w:val="24"/>
+        </w:rPr>
+        <w:t>. Here’s what to do next.</w:t>
       </w:r>
     </w:p>
     <w:p>
@@ -253,128 +269,6 @@
                           <pic:cNvPicPr/>
                         </pic:nvPicPr>
                         <pic:blipFill>
-                          <a:blip r:embed="rId6">
-                            <a:extLst>
-                              <a:ext uri="{96DAC541-7B7A-43D3-8B79-37D633B846F1}">
-                                <asvg:svgBlip xmlns:asvg="http://schemas.microsoft.com/office/drawing/2016/SVG/main" r:embed="rId7"/>
-                              </a:ext>
-                            </a:extLst>
-                          </a:blip>
-                          <a:stretch>
-                            <a:fillRect/>
-                          </a:stretch>
-                        </pic:blipFill>
-                        <pic:spPr>
-                          <a:xfrm>
-                            <a:off x="0" y="0"/>
-                            <a:ext cx="914400" cy="914400"/>
-                          </a:xfrm>
-                          <a:prstGeom prst="rect">
-                            <a:avLst/>
-                          </a:prstGeom>
-                        </pic:spPr>
-                      </pic:pic>
-                    </a:graphicData>
-                  </a:graphic>
-                </wp:inline>
-              </w:drawing>
-            </w:r>
-          </w:p>
-          <w:p>
-            <w:pPr>
-              <w:rPr>
-                <w:rFonts w:ascii="Muli" w:hAnsi="Muli"/>
-                <w:sz w:val="24"/>
-                <w:szCs w:val="24"/>
-              </w:rPr>
-            </w:pPr>
-            <w:r>
-              <w:rPr>
-                <w:rFonts w:ascii="Muli" w:hAnsi="Muli"/>
-                <w:sz w:val="24"/>
-                <w:szCs w:val="24"/>
-              </w:rPr>
-              <w:t xml:space="preserve"> </w:t>
-            </w:r>
-          </w:p>
-        </w:tc>
-        <w:tc>
-          <w:tcPr>
-            <w:tcW w:w="8100" w:type="dxa"/>
-          </w:tcPr>
-          <w:p>
-            <w:pPr>
-              <w:ind w:left="360"/>
-              <w:rPr>
-                <w:rFonts w:ascii="Muli" w:hAnsi="Muli"/>
-                <w:sz w:val="24"/>
-                <w:szCs w:val="24"/>
-              </w:rPr>
-            </w:pPr>
-          </w:p>
-          <w:p>
-            <w:pPr>
-              <w:pStyle w:val="ListParagraph"/>
-              <w:numPr>
-                <w:ilvl w:val="0"/>
-                <w:numId w:val="1"/>
-              </w:numPr>
-              <w:spacing w:line="240" w:lineRule="auto"/>
-              <w:rPr>
-                <w:rFonts w:ascii="Muli" w:hAnsi="Muli"/>
-                <w:sz w:val="24"/>
-                <w:szCs w:val="24"/>
-              </w:rPr>
-            </w:pPr>
-            <w:r>
-              <w:rPr>
-                <w:rFonts w:ascii="Muli" w:hAnsi="Muli"/>
-                <w:sz w:val="24"/>
-                <w:szCs w:val="24"/>
-              </w:rPr>
-              <w:t>Print the letters.</w:t>
-            </w:r>
-          </w:p>
-        </w:tc>
-      </w:tr>
-      <w:tr>
-        <w:tc>
-          <w:tcPr>
-            <w:tcW w:w="1795" w:type="dxa"/>
-            <w:vAlign w:val="center"/>
-          </w:tcPr>
-          <w:p>
-            <w:pPr>
-              <w:rPr>
-                <w:rFonts w:ascii="Muli" w:hAnsi="Muli"/>
-                <w:sz w:val="24"/>
-                <w:szCs w:val="24"/>
-              </w:rPr>
-            </w:pPr>
-            <w:r>
-              <w:rPr>
-                <w:rFonts w:ascii="Muli" w:hAnsi="Muli"/>
-                <w:noProof/>
-                <w:sz w:val="24"/>
-                <w:szCs w:val="24"/>
-                <w:lang w:val="en-US"/>
-              </w:rPr>
-              <w:drawing>
-                <wp:inline distT="0" distB="0" distL="0" distR="0" wp14:anchorId="55C2661E" wp14:editId="045A37C0">
-                  <wp:extent cx="914400" cy="914400"/>
-                  <wp:effectExtent l="0" t="0" r="0" b="0"/>
-                  <wp:docPr id="3" name="Picture 3"/>
-                  <wp:cNvGraphicFramePr>
-                    <a:graphicFrameLocks xmlns:a="http://schemas.openxmlformats.org/drawingml/2006/main" noChangeAspect="1"/>
-                  </wp:cNvGraphicFramePr>
-                  <a:graphic xmlns:a="http://schemas.openxmlformats.org/drawingml/2006/main">
-                    <a:graphicData uri="http://schemas.openxmlformats.org/drawingml/2006/picture">
-                      <pic:pic xmlns:pic="http://schemas.openxmlformats.org/drawingml/2006/picture">
-                        <pic:nvPicPr>
-                          <pic:cNvPr id="3" name="Picture 3"/>
-                          <pic:cNvPicPr/>
-                        </pic:nvPicPr>
-                        <pic:blipFill>
                           <a:blip r:embed="rId8">
                             <a:extLst>
                               <a:ext uri="{96DAC541-7B7A-43D3-8B79-37D633B846F1}">
@@ -426,6 +320,7 @@
           </w:tcPr>
           <w:p>
             <w:pPr>
+              <w:ind w:left="360"/>
               <w:rPr>
                 <w:rFonts w:ascii="Muli" w:hAnsi="Muli"/>
                 <w:sz w:val="24"/>
@@ -453,15 +348,7 @@
                 <w:sz w:val="24"/>
                 <w:szCs w:val="24"/>
               </w:rPr>
-              <w:t>Sign the letter to the creditor</w:t>
-            </w:r>
-            <w:r>
-              <w:rPr>
-                <w:rFonts w:ascii="Muli" w:hAnsi="Muli"/>
-                <w:sz w:val="24"/>
-                <w:szCs w:val="24"/>
-              </w:rPr>
-              <w:t>.</w:t>
+              <w:t>Print the letters.</w:t>
             </w:r>
           </w:p>
         </w:tc>
@@ -489,10 +376,10 @@
                 <w:lang w:val="en-US"/>
               </w:rPr>
               <w:drawing>
-                <wp:inline distT="0" distB="0" distL="0" distR="0" wp14:anchorId="792E2A0D" wp14:editId="1C865AF0">
+                <wp:inline distT="0" distB="0" distL="0" distR="0" wp14:anchorId="55C2661E" wp14:editId="045A37C0">
                   <wp:extent cx="914400" cy="914400"/>
                   <wp:effectExtent l="0" t="0" r="0" b="0"/>
-                  <wp:docPr id="6" name="Picture 6"/>
+                  <wp:docPr id="3" name="Picture 3"/>
                   <wp:cNvGraphicFramePr>
                     <a:graphicFrameLocks xmlns:a="http://schemas.openxmlformats.org/drawingml/2006/main" noChangeAspect="1"/>
                   </wp:cNvGraphicFramePr>
@@ -500,7 +387,7 @@
                     <a:graphicData uri="http://schemas.openxmlformats.org/drawingml/2006/picture">
                       <pic:pic xmlns:pic="http://schemas.openxmlformats.org/drawingml/2006/picture">
                         <pic:nvPicPr>
-                          <pic:cNvPr id="6" name="Picture 6"/>
+                          <pic:cNvPr id="3" name="Picture 3"/>
                           <pic:cNvPicPr/>
                         </pic:nvPicPr>
                         <pic:blipFill>
@@ -582,15 +469,7 @@
                 <w:sz w:val="24"/>
                 <w:szCs w:val="24"/>
               </w:rPr>
-              <w:t>Keep copies of the letters for your records</w:t>
-            </w:r>
-            <w:r>
-              <w:rPr>
-                <w:rFonts w:ascii="Muli" w:hAnsi="Muli"/>
-                <w:sz w:val="24"/>
-                <w:szCs w:val="24"/>
-              </w:rPr>
-              <w:t>.</w:t>
+              <w:t>Sign the letter to the creditor.</w:t>
             </w:r>
           </w:p>
         </w:tc>
@@ -618,10 +497,10 @@
                 <w:lang w:val="en-US"/>
               </w:rPr>
               <w:drawing>
-                <wp:inline distT="0" distB="0" distL="0" distR="0" wp14:anchorId="3871F258" wp14:editId="63D0A67B">
+                <wp:inline distT="0" distB="0" distL="0" distR="0" wp14:anchorId="792E2A0D" wp14:editId="1C865AF0">
                   <wp:extent cx="914400" cy="914400"/>
                   <wp:effectExtent l="0" t="0" r="0" b="0"/>
-                  <wp:docPr id="5" name="Picture 5"/>
+                  <wp:docPr id="6" name="Picture 6"/>
                   <wp:cNvGraphicFramePr>
                     <a:graphicFrameLocks xmlns:a="http://schemas.openxmlformats.org/drawingml/2006/main" noChangeAspect="1"/>
                   </wp:cNvGraphicFramePr>
@@ -629,7 +508,7 @@
                     <a:graphicData uri="http://schemas.openxmlformats.org/drawingml/2006/picture">
                       <pic:pic xmlns:pic="http://schemas.openxmlformats.org/drawingml/2006/picture">
                         <pic:nvPicPr>
-                          <pic:cNvPr id="5" name="Picture 5"/>
+                          <pic:cNvPr id="6" name="Picture 6"/>
                           <pic:cNvPicPr/>
                         </pic:nvPicPr>
                         <pic:blipFill>
@@ -668,6 +547,14 @@
                 <w:szCs w:val="24"/>
               </w:rPr>
             </w:pPr>
+            <w:r>
+              <w:rPr>
+                <w:rFonts w:ascii="Muli" w:hAnsi="Muli"/>
+                <w:sz w:val="24"/>
+                <w:szCs w:val="24"/>
+              </w:rPr>
+              <w:t xml:space="preserve"> </w:t>
+            </w:r>
           </w:p>
         </w:tc>
         <w:tc>
@@ -703,6 +590,119 @@
                 <w:sz w:val="24"/>
                 <w:szCs w:val="24"/>
               </w:rPr>
+              <w:t>Keep copies of the letters for your records.</w:t>
+            </w:r>
+          </w:p>
+        </w:tc>
+      </w:tr>
+      <w:tr>
+        <w:tc>
+          <w:tcPr>
+            <w:tcW w:w="1795" w:type="dxa"/>
+            <w:vAlign w:val="center"/>
+          </w:tcPr>
+          <w:p>
+            <w:pPr>
+              <w:rPr>
+                <w:rFonts w:ascii="Muli" w:hAnsi="Muli"/>
+                <w:sz w:val="24"/>
+                <w:szCs w:val="24"/>
+              </w:rPr>
+            </w:pPr>
+            <w:r>
+              <w:rPr>
+                <w:rFonts w:ascii="Muli" w:hAnsi="Muli"/>
+                <w:noProof/>
+                <w:sz w:val="24"/>
+                <w:szCs w:val="24"/>
+                <w:lang w:val="en-US"/>
+              </w:rPr>
+              <w:drawing>
+                <wp:inline distT="0" distB="0" distL="0" distR="0" wp14:anchorId="3871F258" wp14:editId="63D0A67B">
+                  <wp:extent cx="914400" cy="914400"/>
+                  <wp:effectExtent l="0" t="0" r="0" b="0"/>
+                  <wp:docPr id="5" name="Picture 5"/>
+                  <wp:cNvGraphicFramePr>
+                    <a:graphicFrameLocks xmlns:a="http://schemas.openxmlformats.org/drawingml/2006/main" noChangeAspect="1"/>
+                  </wp:cNvGraphicFramePr>
+                  <a:graphic xmlns:a="http://schemas.openxmlformats.org/drawingml/2006/main">
+                    <a:graphicData uri="http://schemas.openxmlformats.org/drawingml/2006/picture">
+                      <pic:pic xmlns:pic="http://schemas.openxmlformats.org/drawingml/2006/picture">
+                        <pic:nvPicPr>
+                          <pic:cNvPr id="5" name="Picture 5"/>
+                          <pic:cNvPicPr/>
+                        </pic:nvPicPr>
+                        <pic:blipFill>
+                          <a:blip r:embed="rId14">
+                            <a:extLst>
+                              <a:ext uri="{96DAC541-7B7A-43D3-8B79-37D633B846F1}">
+                                <asvg:svgBlip xmlns:asvg="http://schemas.microsoft.com/office/drawing/2016/SVG/main" r:embed="rId15"/>
+                              </a:ext>
+                            </a:extLst>
+                          </a:blip>
+                          <a:stretch>
+                            <a:fillRect/>
+                          </a:stretch>
+                        </pic:blipFill>
+                        <pic:spPr>
+                          <a:xfrm>
+                            <a:off x="0" y="0"/>
+                            <a:ext cx="914400" cy="914400"/>
+                          </a:xfrm>
+                          <a:prstGeom prst="rect">
+                            <a:avLst/>
+                          </a:prstGeom>
+                        </pic:spPr>
+                      </pic:pic>
+                    </a:graphicData>
+                  </a:graphic>
+                </wp:inline>
+              </w:drawing>
+            </w:r>
+          </w:p>
+          <w:p>
+            <w:pPr>
+              <w:rPr>
+                <w:rFonts w:ascii="Muli" w:hAnsi="Muli"/>
+                <w:sz w:val="24"/>
+                <w:szCs w:val="24"/>
+              </w:rPr>
+            </w:pPr>
+          </w:p>
+        </w:tc>
+        <w:tc>
+          <w:tcPr>
+            <w:tcW w:w="8100" w:type="dxa"/>
+          </w:tcPr>
+          <w:p>
+            <w:pPr>
+              <w:rPr>
+                <w:rFonts w:ascii="Muli" w:hAnsi="Muli"/>
+                <w:sz w:val="24"/>
+                <w:szCs w:val="24"/>
+              </w:rPr>
+            </w:pPr>
+          </w:p>
+          <w:p>
+            <w:pPr>
+              <w:pStyle w:val="ListParagraph"/>
+              <w:numPr>
+                <w:ilvl w:val="0"/>
+                <w:numId w:val="1"/>
+              </w:numPr>
+              <w:spacing w:line="240" w:lineRule="auto"/>
+              <w:rPr>
+                <w:rFonts w:ascii="Muli" w:hAnsi="Muli"/>
+                <w:sz w:val="24"/>
+                <w:szCs w:val="24"/>
+              </w:rPr>
+            </w:pPr>
+            <w:r>
+              <w:rPr>
+                <w:rFonts w:ascii="Muli" w:hAnsi="Muli"/>
+                <w:sz w:val="24"/>
+                <w:szCs w:val="24"/>
+              </w:rPr>
               <w:t xml:space="preserve">Deliver the letter to the creditor by certified mail. </w:t>
             </w:r>
             <w:r>
@@ -721,7 +721,7 @@
               </w:rPr>
               <w:t xml:space="preserve">at </w:t>
             </w:r>
-            <w:hyperlink r:id="rId14" w:history="1">
+            <w:hyperlink r:id="rId16" w:history="1">
               <w:r>
                 <w:rPr>
                   <w:rStyle w:val="Hyperlink"/>
@@ -784,10 +784,10 @@
                           <pic:cNvPicPr/>
                         </pic:nvPicPr>
                         <pic:blipFill>
-                          <a:blip r:embed="rId15">
+                          <a:blip r:embed="rId17">
                             <a:extLst>
                               <a:ext uri="{96DAC541-7B7A-43D3-8B79-37D633B846F1}">
-                                <asvg:svgBlip xmlns:asvg="http://schemas.microsoft.com/office/drawing/2016/SVG/main" r:embed="rId16"/>
+                                <asvg:svgBlip xmlns:asvg="http://schemas.microsoft.com/office/drawing/2016/SVG/main" r:embed="rId18"/>
                               </a:ext>
                             </a:extLst>
                           </a:blip>
@@ -846,7 +846,39 @@
                 <w:sz w:val="24"/>
                 <w:szCs w:val="24"/>
               </w:rPr>
-              <w:t>Once you learn the repossession agency’s name and address, add them to the letter to the repossession agency, sign and date it, and send it by certified mail.</w:t>
+              <w:t>Once you learn the repossession agency’s name and address, add them to the letter to the repossession agency</w:t>
+            </w:r>
+            <w:r>
+              <w:rPr>
+                <w:rFonts w:ascii="Muli" w:hAnsi="Muli"/>
+                <w:sz w:val="24"/>
+                <w:szCs w:val="24"/>
+              </w:rPr>
+              <w:t>. Then,</w:t>
+            </w:r>
+            <w:r>
+              <w:rPr>
+                <w:rFonts w:ascii="Muli" w:hAnsi="Muli"/>
+                <w:sz w:val="24"/>
+                <w:szCs w:val="24"/>
+              </w:rPr>
+              <w:t xml:space="preserve"> sign </w:t>
+            </w:r>
+            <w:r>
+              <w:rPr>
+                <w:rFonts w:ascii="Muli" w:hAnsi="Muli"/>
+                <w:sz w:val="24"/>
+                <w:szCs w:val="24"/>
+              </w:rPr>
+              <w:t>it,</w:t>
+            </w:r>
+            <w:r>
+              <w:rPr>
+                <w:rFonts w:ascii="Muli" w:hAnsi="Muli"/>
+                <w:sz w:val="24"/>
+                <w:szCs w:val="24"/>
+              </w:rPr>
+              <w:t xml:space="preserve"> date it, and send it by certified mail.</w:t>
             </w:r>
           </w:p>
         </w:tc>
@@ -924,21 +956,8 @@
         <w:t>.</w:t>
       </w:r>
     </w:p>
-    <w:p>
-      <w:pPr>
-        <w:rPr>
-          <w:rFonts w:ascii="Muli" w:hAnsi="Muli"/>
-          <w:b/>
-          <w:bCs/>
-          <w:sz w:val="28"/>
-          <w:szCs w:val="28"/>
-        </w:rPr>
-      </w:pPr>
-    </w:p>
-    <w:p/>
-    <w:p/>
     <w:sectPr>
-      <w:footerReference w:type="first" r:id="rId17"/>
+      <w:footerReference w:type="first" r:id="rId19"/>
       <w:pgSz w:w="12240" w:h="15840"/>
       <w:pgMar w:top="864" w:right="1152" w:bottom="1440" w:left="1440" w:header="720" w:footer="720" w:gutter="0"/>
       <w:pgNumType w:start="1"/>
@@ -948,6 +967,31 @@
     </w:sectPr>
   </w:body>
 </w:document>
+</file>
+
+<file path=word/endnotes.xml><?xml version="1.0" encoding="utf-8"?>
+<w:endnotes xmlns:wpc="http://schemas.microsoft.com/office/word/2010/wordprocessingCanvas" xmlns:cx="http://schemas.microsoft.com/office/drawing/2014/chartex" xmlns:cx1="http://schemas.microsoft.com/office/drawing/2015/9/8/chartex" xmlns:cx2="http://schemas.microsoft.com/office/drawing/2015/10/21/chartex" xmlns:cx3="http://schemas.microsoft.com/office/drawing/2016/5/9/chartex" xmlns:cx4="http://schemas.microsoft.com/office/drawing/2016/5/10/chartex" xmlns:cx5="http://schemas.microsoft.com/office/drawing/2016/5/11/chartex" xmlns:cx6="http://schemas.microsoft.com/office/drawing/2016/5/12/chartex" xmlns:cx7="http://schemas.microsoft.com/office/drawing/2016/5/13/chartex" xmlns:cx8="http://schemas.microsoft.com/office/drawing/2016/5/14/chartex" xmlns:mc="http://schemas.openxmlformats.org/markup-compatibility/2006" xmlns:aink="http://schemas.microsoft.com/office/drawing/2016/ink" xmlns:am3d="http://schemas.microsoft.com/office/drawing/2017/model3d" xmlns:o="urn:schemas-microsoft-com:office:office" xmlns:oel="http://schemas.microsoft.com/office/2019/extlst" xmlns:r="http://schemas.openxmlformats.org/officeDocument/2006/relationships" xmlns:m="http://schemas.openxmlformats.org/officeDocument/2006/math" xmlns:v="urn:schemas-microsoft-com:vml" xmlns:wp14="http://schemas.microsoft.com/office/word/2010/wordprocessingDrawing" xmlns:wp="http://schemas.openxmlformats.org/drawingml/2006/wordprocessingDrawing" xmlns:w10="urn:schemas-microsoft-com:office:word" xmlns:w="http://schemas.openxmlformats.org/wordprocessingml/2006/main" xmlns:w14="http://schemas.microsoft.com/office/word/2010/wordml" xmlns:w15="http://schemas.microsoft.com/office/word/2012/wordml" xmlns:w16cex="http://schemas.microsoft.com/office/word/2018/wordml/cex" xmlns:w16cid="http://schemas.microsoft.com/office/word/2016/wordml/cid" xmlns:w16="http://schemas.microsoft.com/office/word/2018/wordml" xmlns:w16du="http://schemas.microsoft.com/office/word/2023/wordml/word16du" xmlns:w16sdtdh="http://schemas.microsoft.com/office/word/2020/wordml/sdtdatahash" xmlns:w16sdtfl="http://schemas.microsoft.com/office/word/2024/wordml/sdtformatlock" xmlns:w16se="http://schemas.microsoft.com/office/word/2015/wordml/symex" xmlns:wpg="http://schemas.microsoft.com/office/word/2010/wordprocessingGroup" xmlns:wpi="http://schemas.microsoft.com/office/word/2010/wordprocessingInk" xmlns:wne="http://schemas.microsoft.com/office/word/2006/wordml" xmlns:wps="http://schemas.microsoft.com/office/word/2010/wordprocessingShape" mc:Ignorable="w14 w15 w16se w16cid w16 w16cex w16sdtdh w16sdtfl w16du wp14">
+  <w:endnote w:type="separator" w:id="-1">
+    <w:p>
+      <w:pPr>
+        <w:spacing w:line="240" w:lineRule="auto"/>
+      </w:pPr>
+      <w:r>
+        <w:separator/>
+      </w:r>
+    </w:p>
+  </w:endnote>
+  <w:endnote w:type="continuationSeparator" w:id="0">
+    <w:p>
+      <w:pPr>
+        <w:spacing w:line="240" w:lineRule="auto"/>
+      </w:pPr>
+      <w:r>
+        <w:continuationSeparator/>
+      </w:r>
+    </w:p>
+  </w:endnote>
+</w:endnotes>
 </file>
 
 <file path=word/footer1.xml><?xml version="1.0" encoding="utf-8"?>
@@ -977,6 +1021,31 @@
     </w:hyperlink>
   </w:p>
 </w:ftr>
+</file>
+
+<file path=word/footnotes.xml><?xml version="1.0" encoding="utf-8"?>
+<w:footnotes xmlns:wpc="http://schemas.microsoft.com/office/word/2010/wordprocessingCanvas" xmlns:cx="http://schemas.microsoft.com/office/drawing/2014/chartex" xmlns:cx1="http://schemas.microsoft.com/office/drawing/2015/9/8/chartex" xmlns:cx2="http://schemas.microsoft.com/office/drawing/2015/10/21/chartex" xmlns:cx3="http://schemas.microsoft.com/office/drawing/2016/5/9/chartex" xmlns:cx4="http://schemas.microsoft.com/office/drawing/2016/5/10/chartex" xmlns:cx5="http://schemas.microsoft.com/office/drawing/2016/5/11/chartex" xmlns:cx6="http://schemas.microsoft.com/office/drawing/2016/5/12/chartex" xmlns:cx7="http://schemas.microsoft.com/office/drawing/2016/5/13/chartex" xmlns:cx8="http://schemas.microsoft.com/office/drawing/2016/5/14/chartex" xmlns:mc="http://schemas.openxmlformats.org/markup-compatibility/2006" xmlns:aink="http://schemas.microsoft.com/office/drawing/2016/ink" xmlns:am3d="http://schemas.microsoft.com/office/drawing/2017/model3d" xmlns:o="urn:schemas-microsoft-com:office:office" xmlns:oel="http://schemas.microsoft.com/office/2019/extlst" xmlns:r="http://schemas.openxmlformats.org/officeDocument/2006/relationships" xmlns:m="http://schemas.openxmlformats.org/officeDocument/2006/math" xmlns:v="urn:schemas-microsoft-com:vml" xmlns:wp14="http://schemas.microsoft.com/office/word/2010/wordprocessingDrawing" xmlns:wp="http://schemas.openxmlformats.org/drawingml/2006/wordprocessingDrawing" xmlns:w10="urn:schemas-microsoft-com:office:word" xmlns:w="http://schemas.openxmlformats.org/wordprocessingml/2006/main" xmlns:w14="http://schemas.microsoft.com/office/word/2010/wordml" xmlns:w15="http://schemas.microsoft.com/office/word/2012/wordml" xmlns:w16cex="http://schemas.microsoft.com/office/word/2018/wordml/cex" xmlns:w16cid="http://schemas.microsoft.com/office/word/2016/wordml/cid" xmlns:w16="http://schemas.microsoft.com/office/word/2018/wordml" xmlns:w16du="http://schemas.microsoft.com/office/word/2023/wordml/word16du" xmlns:w16sdtdh="http://schemas.microsoft.com/office/word/2020/wordml/sdtdatahash" xmlns:w16sdtfl="http://schemas.microsoft.com/office/word/2024/wordml/sdtformatlock" xmlns:w16se="http://schemas.microsoft.com/office/word/2015/wordml/symex" xmlns:wpg="http://schemas.microsoft.com/office/word/2010/wordprocessingGroup" xmlns:wpi="http://schemas.microsoft.com/office/word/2010/wordprocessingInk" xmlns:wne="http://schemas.microsoft.com/office/word/2006/wordml" xmlns:wps="http://schemas.microsoft.com/office/word/2010/wordprocessingShape" mc:Ignorable="w14 w15 w16se w16cid w16 w16cex w16sdtdh w16sdtfl w16du wp14">
+  <w:footnote w:type="separator" w:id="-1">
+    <w:p>
+      <w:pPr>
+        <w:spacing w:line="240" w:lineRule="auto"/>
+      </w:pPr>
+      <w:r>
+        <w:separator/>
+      </w:r>
+    </w:p>
+  </w:footnote>
+  <w:footnote w:type="continuationSeparator" w:id="0">
+    <w:p>
+      <w:pPr>
+        <w:spacing w:line="240" w:lineRule="auto"/>
+      </w:pPr>
+      <w:r>
+        <w:continuationSeparator/>
+      </w:r>
+    </w:p>
+  </w:footnote>
+</w:footnotes>
 </file>
 
 <file path=word/numbering.xml><?xml version="1.0" encoding="utf-8"?>

</xml_diff>